<commit_message>
chore(idsup, washctapp): regenerate and re-render the four reported folders on the current model; reasons updated (pilcrow and URL note fixed; line fit, hyphen before a parenthesis, '* * *' in LaTeX remain) (fb-595.54.47)
Co-Authored-By: Claude Opus 5.5 <noreply@anthropic.com>
</commit_message>
<xml_diff>
--- a/courts/ninth-circuit/idaho/state/supreme-court/motion-brief/usage/OUTPUT-motion-brief.docx
+++ b/courts/ninth-circuit/idaho/state/supreme-court/motion-brief/usage/OUTPUT-motion-brief.docx
@@ -1585,13 +1585,7 @@
         <w:pStyle w:val="BodyText"/>
       </w:pPr>
       <w:r>
-        <w:t xml:space="preserve">Portions of these declarations also contain speculative statements as to how Idaho Code § 34</w:t>
-      </w:r>
-      <w:r>
-        <w:noBreakHyphen/>
-      </w:r>
-      <w:r>
-        <w:t xml:space="preserve">1805(2) and 1813(2)⁠(a) will affect future initiative and referenda efforts. Similarly, portions of these declarations contain speculative statements as to how the challenged provisions would have allegedly hindered Reclaim Idaho’s efforts to put the 2018 initiative to expand Medicaid on the ballot, and the Idaho Education Association’s efforts to qualify the three 2012 referenda petitions for the ballot.</w:t>
+        <w:t xml:space="preserve">Portions of these declarations also contain speculative statements as to how Idaho Code § 34-⁠1805(2) and 1813(2)⁠(a) will affect future initiative and referenda efforts. Similarly, portions of these declarations contain speculative statements as to how the challenged provisions would have allegedly hindered Reclaim Idaho’s efforts to put the 2018 initiative to expand Medicaid on the ballot, and the Idaho Education Association’s efforts to qualify the three 2012 referenda petitions for the ballot.</w:t>
       </w:r>
     </w:p>
     <w:p>
@@ -1599,13 +1593,7 @@
         <w:pStyle w:val="BodyTextNote"/>
       </w:pPr>
       <w:r>
-        <w:t xml:space="preserve">Additionally, the declarants also make statements regarding a final issue for this court to decide: whether Idaho Code §§ 34</w:t>
-      </w:r>
-      <w:r>
-        <w:noBreakHyphen/>
-      </w:r>
-      <w:r>
-        <w:t xml:space="preserve">1805(2) and 1813(2)⁠(a) constitute reasonable and workable conditions and manner requirements governing the initiative and referenda process under Article III, § 1 of the Idaho Constitution.</w:t>
+        <w:t xml:space="preserve">Additionally, the declarants also make statements regarding a final issue for this court to decide: whether Idaho Code §§ 34-⁠1805(2) and 1813(2)⁠(a) constitute reasonable and workable conditions and manner requirements governing the initiative and referenda process under Article III, § 1 of the Idaho Constitution.</w:t>
       </w:r>
       <w:r>
         <w:rPr>
@@ -2350,7 +2338,7 @@
         <w:pStyle w:val="XdQuoteOnly"/>
       </w:pPr>
       <w:r>
-        <w:t xml:space="preserve">Paragraph 31: Had we needed to meet the geographical requirement in Senate Bill 1110 requiring that 6% of signatures must come from every single one of Idaho’s 35 legislative districts, it would have been overly burdensome and our path to success would have certainly been vastly more difficult . . . I do not think it would have been possible.</w:t>
+        <w:t xml:space="preserve">Paragraph 31: Had we needed to meet the geographical requirement in Senate Bill 1110 requiring that 6% of signatures must come from every single one of Idaho’s 35 legislative districts, it would have been overly burdensome and our path to success would have certainly been vastly more difficult . . . I do not think it would have been possible.</w:t>
       </w:r>
       <w:r>
         <w:rPr>
@@ -2532,19 +2520,7 @@
         <w:pStyle w:val="BodyText"/>
       </w:pPr>
       <w:r>
-        <w:t xml:space="preserve">If this Court were to decide the Petition on the merits, the ultimate question that this Court must decide is whether the challenged provisions constitute permissible conditions and manner for the initiative process set by the legislature under Article III, § 1, that is to say, whether the challenged provisions are reasonable and workable. And, if this Court accepts Petitioners’ (incorrect) formulation of this analysis, this Court will have to decide whether Idaho Code § 34</w:t>
-      </w:r>
-      <w:r>
-        <w:noBreakHyphen/>
-      </w:r>
-      <w:r>
-        <w:t xml:space="preserve">1805(2) and Idaho Code § 34</w:t>
-      </w:r>
-      <w:r>
-        <w:noBreakHyphen/>
-      </w:r>
-      <w:r>
-        <w:t xml:space="preserve">1813(2)⁠(a) place an impermissible burden on the citizens of Idaho to exercise their constitutional rights under Article III, § 1.</w:t>
+        <w:t xml:space="preserve">If this Court were to decide the Petition on the merits, the ultimate question that this Court must decide is whether the challenged provisions constitute permissible conditions and manner for the initiative process set by the legislature under Article III, § 1, that is to say, whether the challenged provisions are reasonable and workable. And, if this Court accepts Petitioners’ (incorrect) formulation of this analysis, this Court will have to decide whether Idaho Code § 34-⁠1805(2) and Idaho Code § 34-⁠1813(2)⁠(a) place an impermissible burden on the citizens of Idaho to exercise their constitutional rights under Article III, § 1.</w:t>
       </w:r>
       <w:r>
         <w:t xml:space="preserve"> </w:t>
@@ -2719,13 +2695,7 @@
         <w:pStyle w:val="XdQuoteOnly"/>
       </w:pPr>
       <w:r>
-        <w:t xml:space="preserve">Paragraph 24: It is also my opinion that Idaho Code § 34</w:t>
-      </w:r>
-      <w:r>
-        <w:noBreakHyphen/>
-      </w:r>
-      <w:r>
-        <w:t xml:space="preserve">1813(2)⁠(a)’s prohibition on any initiative taking effect before July 1 of the year following its passage in the general election violates the right of the people,</w:t>
+        <w:t xml:space="preserve">Paragraph 24: It is also my opinion that Idaho Code § 34-⁠1813(2)⁠(a)’s prohibition on any initiative taking effect before July 1 of the year following its passage in the general election violates the right of the people,</w:t>
       </w:r>
       <w:r>
         <w:t xml:space="preserve"> </w:t>
@@ -4582,13 +4552,7 @@
         <w:t xml:space="preserve"> </w:t>
       </w:r>
       <w:r>
-        <w:t xml:space="preserve">Respondents recognize that their expert, Damon Cann, Ph.D. provides opinions regarding the foreseeable impact (or lack thereof) of Idaho Code § 34</w:t>
-      </w:r>
-      <w:r>
-        <w:noBreakHyphen/>
-      </w:r>
-      <w:r>
-        <w:t xml:space="preserve">1805(2) on future signature drives. Unlike speculative statements in the declarations above, Dr. Cann’s conclusions are properly based on the empirical data outlined in his declaration.</w:t>
+        <w:t xml:space="preserve">Respondents recognize that their expert, Damon Cann, Ph.D. provides opinions regarding the foreseeable impact (or lack thereof) of Idaho Code § 34-⁠1805(2) on future signature drives. Unlike speculative statements in the declarations above, Dr. Cann’s conclusions are properly based on the empirical data outlined in his declaration.</w:t>
       </w:r>
     </w:p>
   </w:footnote>
@@ -5497,6 +5461,33 @@
     <w:pPr>
       <w:spacing w:before="0" w:after="0" w:line="322" w:lineRule="exact"/>
       <w:ind w:left="2160" w:hanging="720"/>
+    </w:pPr>
+  </w:style>
+  <w:style w:type="paragraph" w:customStyle="1" w:styleId="XdQuoteList1">
+    <w:name w:val="Xd Quote List 1"/>
+    <w:basedOn w:val="Normal"/>
+    <w:qFormat/>
+    <w:pPr>
+      <w:spacing w:before="0" w:after="0" w:line="322" w:lineRule="exact"/>
+      <w:ind w:left="1440" w:right="720" w:hanging="720"/>
+    </w:pPr>
+  </w:style>
+  <w:style w:type="paragraph" w:customStyle="1" w:styleId="XdQuoteList2">
+    <w:name w:val="Xd Quote List 2"/>
+    <w:basedOn w:val="Normal"/>
+    <w:qFormat/>
+    <w:pPr>
+      <w:spacing w:before="0" w:after="0" w:line="322" w:lineRule="exact"/>
+      <w:ind w:left="2160" w:right="720" w:hanging="720"/>
+    </w:pPr>
+  </w:style>
+  <w:style w:type="paragraph" w:customStyle="1" w:styleId="XdQuoteList3">
+    <w:name w:val="Xd Quote List 3"/>
+    <w:basedOn w:val="Normal"/>
+    <w:qFormat/>
+    <w:pPr>
+      <w:spacing w:before="0" w:after="0" w:line="322" w:lineRule="exact"/>
+      <w:ind w:left="2880" w:right="720" w:hanging="720"/>
     </w:pPr>
   </w:style>
   <w:style w:type="paragraph" w:customStyle="1" w:styleId="XdQuoteOnly">

</xml_diff>